<commit_message>
Document unnotarized Mac download and first launch
</commit_message>
<xml_diff>
--- a/docs/FilingLens_Desktop_User_Guide.docx
+++ b/docs/FilingLens_Desktop_User_Guide.docx
@@ -23,7 +23,7 @@
         <w:pStyle w:val="Heading1"/>
       </w:pPr>
       <w:r>
-        <w:t>Open the app</w:t>
+        <w:t>Download and open the Mac app</w:t>
       </w:r>
     </w:p>
     <w:p>
@@ -31,25 +31,7 @@
         <w:pStyle w:val="ListNumber"/>
       </w:pPr>
       <w:r>
-        <w:t xml:space="preserve">In Finder, open </w:t>
-      </w:r>
-      <w:r>
-        <w:rPr>
-          <w:b/>
-        </w:rPr>
-        <w:t>Applications</w:t>
-      </w:r>
-      <w:r>
-        <w:t xml:space="preserve"> in your home folder and double-click </w:t>
-      </w:r>
-      <w:r>
-        <w:rPr>
-          <w:b/>
-        </w:rPr>
-        <w:t>FilingLens.app</w:t>
-      </w:r>
-      <w:r>
-        <w:t>.</w:t>
+        <w:t>On an Apple Silicon Mac running macOS 14 or newer, download FilingLens-0.2.0-macOS-arm64.zip from https://github.com/asapino308/FilingLens/releases under Assets.</w:t>
       </w:r>
     </w:p>
     <w:p>
@@ -57,17 +39,7 @@
         <w:pStyle w:val="ListNumber"/>
       </w:pPr>
       <w:r>
-        <w:t xml:space="preserve">Developers can find a local build under </w:t>
-      </w:r>
-      <w:r>
-        <w:rPr>
-          <w:rFonts w:ascii="Menlo" w:hAnsi="Menlo"/>
-          <w:sz w:val="18"/>
-        </w:rPr>
-        <w:t>desktop/src-tauri/target/release/bundle/macos</w:t>
-      </w:r>
-      <w:r>
-        <w:t>.</w:t>
+        <w:t>In Finder, double-click the ZIP and move FilingLens.app into Applications (Finder &gt; Go &gt; Applications).</w:t>
       </w:r>
     </w:p>
     <w:p>
@@ -75,37 +47,47 @@
         <w:pStyle w:val="ListNumber"/>
       </w:pPr>
       <w:r>
-        <w:t>Allow a little time on the first launch while the bundled local service starts. You do not need to run a command or visit a local web address.</w:t>
+        <w:t>Double-click FilingLens.app. macOS may say that it cannot check the app for malicious software or cannot verify the developer. Dismiss the alert without moving the app to Trash.</w:t>
+      </w:r>
+    </w:p>
+    <w:p>
+      <w:pPr>
+        <w:pStyle w:val="ListNumber"/>
+      </w:pPr>
+      <w:r>
+        <w:t>Open Apple menu &gt; System Settings &gt; Privacy &amp; Security. In Security, find the blocked FilingLens app and click Open or Open Anyway, depending on your macOS version.</w:t>
+      </w:r>
+    </w:p>
+    <w:p>
+      <w:pPr>
+        <w:pStyle w:val="ListNumber"/>
+      </w:pPr>
+      <w:r>
+        <w:t>Confirm the follow-up Open Anyway or Open prompt and enter your Mac login password if asked. Apple says Open Anyway remains available for about one hour after the blocked launch.</w:t>
+      </w:r>
+    </w:p>
+    <w:p>
+      <w:pPr>
+        <w:pStyle w:val="ListNumber"/>
+      </w:pPr>
+      <w:r>
+        <w:t>Wait a few seconds for the window and bundled local service. No Terminal command, Python installation, or browser address is needed.</w:t>
+      </w:r>
+    </w:p>
+    <w:p>
+      <w:pPr/>
+      <w:r>
+        <w:t>Normal research requires internet access for SEC filings. Cloud AI is optional and contacts the chosen provider only when selected. FilingLens does not need Full Disk Access or access to your documents for normal research. If macOS asks for Keychain access while saving an AI key, confirm that you initiated the save.</w:t>
       </w:r>
     </w:p>
     <w:p>
       <w:r>
-        <w:t xml:space="preserve">Developer builds may be unsigned. A public release must be code signed and notarized before distribution. The original </w:t>
-      </w:r>
-      <w:r>
-        <w:rPr>
-          <w:rFonts w:ascii="Menlo" w:hAnsi="Menlo"/>
-          <w:sz w:val="18"/>
-        </w:rPr>
-        <w:t>Launch FilingLens.command</w:t>
-      </w:r>
-      <w:r>
-        <w:t xml:space="preserve"> still starts the Streamlit source interface if you need it.</w:t>
+        <w:t>The current download has an ad hoc code signature and has not been notarized by Apple. Only use Open Anyway for a ZIP from the FilingLens GitHub release page. If macOS says the app contains malware, is damaged, or has been modified, stop and report the issue. Apple explains the controls at https://support.apple.com/guide/mac-help/mh40616/mac.</w:t>
       </w:r>
     </w:p>
     <w:p>
       <w:r>
-        <w:t xml:space="preserve">On the first packaged launch, FilingLens opens Settings so you can enter your own SEC contact. The download has no saved research or AI key. After use, your SEC cache and preferences remain under </w:t>
-      </w:r>
-      <w:r>
-        <w:rPr>
-          <w:rFonts w:ascii="Menlo" w:hAnsi="Menlo"/>
-          <w:sz w:val="18"/>
-        </w:rPr>
-        <w:t>Library/Application Support/FilingLens</w:t>
-      </w:r>
-      <w:r>
-        <w:t>, and optional cloud AI keys remain in your macOS Keychain. The app does not import settings or cache from a source checkout.</w:t>
+        <w:t>On first launch, FilingLens opens Settings for your SEC contact. The download has no saved research or AI key. After use, SEC cache and preferences remain under ~/Library/Application Support/FilingLens; optional cloud AI keys remain in macOS Keychain. Reinstalling on the same Mac account preserves earlier local data.</w:t>
       </w:r>
     </w:p>
     <w:p>
@@ -132,16 +114,7 @@
     </w:p>
     <w:p>
       <w:r>
-        <w:t xml:space="preserve">Enter a name and contact email in </w:t>
-      </w:r>
-      <w:r>
-        <w:rPr>
-          <w:b/>
-        </w:rPr>
-        <w:t>SEC User-Agent</w:t>
-      </w:r>
-      <w:r>
-        <w:t xml:space="preserve"> on first launch, then save. The SEC public-data APIs do not require an API key; they ask automated clients to identify themselves in a request header. The contact address is sent to SEC.gov and is not displayed to other app users.</w:t>
+        <w:t>Enter a name and monitored contact email in SEC User-Agent on first launch, then save. SEC public-data APIs do not require an API key. The contact is sent to SEC.gov in a request header and is not displayed to other users. FilingLens limits request speed and caches responses on your Mac.</w:t>
       </w:r>
     </w:p>
     <w:p>

</xml_diff>

<commit_message>
Release 0.3.0 evidence trails and historical research with security fixes
</commit_message>
<xml_diff>
--- a/docs/FilingLens_Desktop_User_Guide.docx
+++ b/docs/FilingLens_Desktop_User_Guide.docx
@@ -27,11 +27,26 @@
       </w:r>
     </w:p>
     <w:p>
-      <w:pPr>
-        <w:pStyle w:val="ListNumber"/>
-      </w:pPr>
       <w:r>
-        <w:t>On an Apple Silicon Mac running macOS 14 or newer, download FilingLens-0.2.0-macOS-arm64.zip from https://github.com/asapino308/FilingLens/releases under Assets.</w:t>
+        <w:t xml:space="preserve">The current ZIP is for </w:t>
+      </w:r>
+      <w:r>
+        <w:rPr>
+          <w:b/>
+        </w:rPr>
+        <w:t>Apple Silicon (M-series) Macs running macOS 14 or newer</w:t>
+      </w:r>
+      <w:r>
+        <w:t xml:space="preserve">. It has an ad hoc code signature and has </w:t>
+      </w:r>
+      <w:r>
+        <w:rPr>
+          <w:b/>
+        </w:rPr>
+        <w:t>not</w:t>
+      </w:r>
+      <w:r>
+        <w:t xml:space="preserve"> been notarized by Apple. Mac users therefore need to approve this specific download manually. It does not require an Apple Developer account, Terminal, Python, Node, or Rust on the user's Mac.</w:t>
       </w:r>
     </w:p>
     <w:p>
@@ -39,7 +54,32 @@
         <w:pStyle w:val="ListNumber"/>
       </w:pPr>
       <w:r>
-        <w:t>In Finder, double-click the ZIP and move FilingLens.app into Applications (Finder &gt; Go &gt; Applications).</w:t>
+        <w:t xml:space="preserve">From the </w:t>
+      </w:r>
+      <w:r>
+        <w:t>FilingLens GitHub Releases page (https://github.com/asapino308/FilingLens/releases)</w:t>
+      </w:r>
+      <w:r>
+        <w:t xml:space="preserve">, download </w:t>
+      </w:r>
+      <w:r>
+        <w:rPr>
+          <w:rFonts w:ascii="Menlo" w:hAnsi="Menlo"/>
+          <w:sz w:val="18"/>
+        </w:rPr>
+        <w:t>FilingLens-0.3.0-macOS-arm64.zip</w:t>
+      </w:r>
+      <w:r>
+        <w:t xml:space="preserve"> under </w:t>
+      </w:r>
+      <w:r>
+        <w:rPr>
+          <w:b/>
+        </w:rPr>
+        <w:t>Assets</w:t>
+      </w:r>
+      <w:r>
+        <w:t>. Do not download a copy from an unrelated site.</w:t>
       </w:r>
     </w:p>
     <w:p>
@@ -47,7 +87,25 @@
         <w:pStyle w:val="ListNumber"/>
       </w:pPr>
       <w:r>
-        <w:t>Double-click FilingLens.app. macOS may say that it cannot check the app for malicious software or cannot verify the developer. Dismiss the alert without moving the app to Trash.</w:t>
+        <w:t xml:space="preserve">In Finder, double-click the ZIP. Move </w:t>
+      </w:r>
+      <w:r>
+        <w:rPr>
+          <w:b/>
+        </w:rPr>
+        <w:t>FilingLens.app</w:t>
+      </w:r>
+      <w:r>
+        <w:t xml:space="preserve"> into </w:t>
+      </w:r>
+      <w:r>
+        <w:rPr>
+          <w:b/>
+        </w:rPr>
+        <w:t>Applications</w:t>
+      </w:r>
+      <w:r>
+        <w:t xml:space="preserve"> (Finder &gt; Go &gt; Applications).</w:t>
       </w:r>
     </w:p>
     <w:p>
@@ -55,7 +113,34 @@
         <w:pStyle w:val="ListNumber"/>
       </w:pPr>
       <w:r>
-        <w:t>Open Apple menu &gt; System Settings &gt; Privacy &amp; Security. In Security, find the blocked FilingLens app and click Open or Open Anyway, depending on your macOS version.</w:t>
+        <w:t xml:space="preserve">Double-click </w:t>
+      </w:r>
+      <w:r>
+        <w:rPr>
+          <w:b/>
+        </w:rPr>
+        <w:t>FilingLens.app</w:t>
+      </w:r>
+      <w:r>
+        <w:t xml:space="preserve">. Because Apple has not notarized this build, macOS may say it </w:t>
+      </w:r>
+      <w:r>
+        <w:rPr>
+          <w:b/>
+        </w:rPr>
+        <w:t>cannot check the app for malicious software</w:t>
+      </w:r>
+      <w:r>
+        <w:t xml:space="preserve"> or </w:t>
+      </w:r>
+      <w:r>
+        <w:rPr>
+          <w:b/>
+        </w:rPr>
+        <w:t>cannot verify the developer</w:t>
+      </w:r>
+      <w:r>
+        <w:t>. Dismiss that alert without moving the app to Trash.</w:t>
       </w:r>
     </w:p>
     <w:p>
@@ -63,7 +148,61 @@
         <w:pStyle w:val="ListNumber"/>
       </w:pPr>
       <w:r>
-        <w:t>Confirm the follow-up Open Anyway or Open prompt and enter your Mac login password if asked. Apple says Open Anyway remains available for about one hour after the blocked launch.</w:t>
+        <w:t xml:space="preserve">Open </w:t>
+      </w:r>
+      <w:r>
+        <w:rPr>
+          <w:b/>
+        </w:rPr>
+        <w:t>Apple menu &gt; System Settings &gt; Privacy &amp; Security</w:t>
+      </w:r>
+      <w:r>
+        <w:t xml:space="preserve">. Scroll to </w:t>
+      </w:r>
+      <w:r>
+        <w:rPr>
+          <w:b/>
+        </w:rPr>
+        <w:t>Security</w:t>
+      </w:r>
+      <w:r>
+        <w:t xml:space="preserve"> and find the blocked FilingLens app. Depending on your macOS version, click </w:t>
+      </w:r>
+      <w:r>
+        <w:rPr>
+          <w:b/>
+        </w:rPr>
+        <w:t>Open</w:t>
+      </w:r>
+      <w:r>
+        <w:t xml:space="preserve"> or </w:t>
+      </w:r>
+      <w:r>
+        <w:rPr>
+          <w:b/>
+        </w:rPr>
+        <w:t>Open Anyway</w:t>
+      </w:r>
+      <w:r>
+        <w:t xml:space="preserve">, then confirm the follow-up </w:t>
+      </w:r>
+      <w:r>
+        <w:rPr>
+          <w:b/>
+        </w:rPr>
+        <w:t>Open Anyway/Open</w:t>
+      </w:r>
+      <w:r>
+        <w:t xml:space="preserve"> prompt. Enter your Mac login password if asked. Apple says </w:t>
+      </w:r>
+      <w:r>
+        <w:rPr>
+          <w:b/>
+        </w:rPr>
+        <w:t>Open Anyway</w:t>
+      </w:r>
+      <w:r>
+        <w:t xml:space="preserve"> is available for about one hour after the first blocked launch; if it is missing, try opening FilingLens again and return to this screen.</w:t>
       </w:r>
     </w:p>
     <w:p>
@@ -71,23 +210,90 @@
         <w:pStyle w:val="ListNumber"/>
       </w:pPr>
       <w:r>
-        <w:t>Wait a few seconds for the window and bundled local service. No Terminal command, Python installation, or browser address is needed.</w:t>
-      </w:r>
-    </w:p>
-    <w:p>
-      <w:pPr/>
-      <w:r>
-        <w:t>Normal research requires internet access for SEC filings. Cloud AI is optional and contacts the chosen provider only when selected. FilingLens does not need Full Disk Access or access to your documents for normal research. If macOS asks for Keychain access while saving an AI key, confirm that you initiated the save.</w:t>
+        <w:t>Wait a few seconds for the window and bundled local service. No browser address or command is needed.</w:t>
       </w:r>
     </w:p>
     <w:p>
       <w:r>
-        <w:t>The current download has an ad hoc code signature and has not been notarized by Apple. Only use Open Anyway for a ZIP from the FilingLens GitHub release page. If macOS says the app contains malware, is damaged, or has been modified, stop and report the issue. Apple explains the controls at https://support.apple.com/guide/mac-help/mh40616/mac.</w:t>
+        <w:t xml:space="preserve">Only use </w:t>
+      </w:r>
+      <w:r>
+        <w:rPr>
+          <w:b/>
+        </w:rPr>
+        <w:t>Open Anyway</w:t>
+      </w:r>
+      <w:r>
+        <w:t xml:space="preserve"> if you trust the ZIP from this repository's release page. If macOS says the app </w:t>
+      </w:r>
+      <w:r>
+        <w:rPr>
+          <w:b/>
+        </w:rPr>
+        <w:t>contains malware</w:t>
+      </w:r>
+      <w:r>
+        <w:t xml:space="preserve">, </w:t>
+      </w:r>
+      <w:r>
+        <w:rPr>
+          <w:b/>
+        </w:rPr>
+        <w:t>is damaged</w:t>
+      </w:r>
+      <w:r>
+        <w:t xml:space="preserve">, or its contents </w:t>
+      </w:r>
+      <w:r>
+        <w:rPr>
+          <w:b/>
+        </w:rPr>
+        <w:t>have been modified</w:t>
+      </w:r>
+      <w:r>
+        <w:t xml:space="preserve">, stop and report the issue instead of overriding the warning. Apple's </w:t>
+      </w:r>
+      <w:r>
+        <w:t>guide to opening an unverified app (https://support.apple.com/guide/mac-help/open-a-mac-app-from-an-unknown-developer-mh40616/mac)</w:t>
+      </w:r>
+      <w:r>
+        <w:t xml:space="preserve"> explains the controls, and its </w:t>
+      </w:r>
+      <w:r>
+        <w:t>app safety guidance (https://support.apple.com/102445)</w:t>
+      </w:r>
+      <w:r>
+        <w:t xml:space="preserve"> explains what the warnings mean.</w:t>
       </w:r>
     </w:p>
     <w:p>
       <w:r>
-        <w:t>On first launch, FilingLens opens Settings for your SEC contact. The download has no saved research or AI key. After use, SEC cache and preferences remain under ~/Library/Application Support/FilingLens; optional cloud AI keys remain in macOS Keychain. Reinstalling on the same Mac account preserves earlier local data.</w:t>
+        <w:t xml:space="preserve">FilingLens needs network access to download public SEC filings and to discover models from configured cloud providers; generation sends research only to the selected provider. Normal research does not require Full Disk Access or access to your documents. If macOS asks for Keychain access while you save a cloud AI key, confirm that you initiated the save in FilingLens before allowing it. The original </w:t>
+      </w:r>
+      <w:r>
+        <w:rPr>
+          <w:rFonts w:ascii="Menlo" w:hAnsi="Menlo"/>
+          <w:sz w:val="18"/>
+        </w:rPr>
+        <w:t>Launch FilingLens.command</w:t>
+      </w:r>
+      <w:r>
+        <w:t xml:space="preserve"> remains available for people building the Streamlit source interface.</w:t>
+      </w:r>
+    </w:p>
+    <w:p>
+      <w:r>
+        <w:t xml:space="preserve">On the first packaged launch, FilingLens opens Settings so you can enter your own SEC contact. The download has no saved research or AI key. After use, your SEC cache and service settings remain under </w:t>
+      </w:r>
+      <w:r>
+        <w:rPr>
+          <w:rFonts w:ascii="Menlo" w:hAnsi="Menlo"/>
+          <w:sz w:val="18"/>
+        </w:rPr>
+        <w:t>~/Library/Application Support/FilingLens</w:t>
+      </w:r>
+      <w:r>
+        <w:t>, and optional cloud AI keys remain in your macOS Keychain. The app does not import settings or cache from a source checkout. Reinstalling on the same Mac account preserves data saved by earlier use; it is not a data-reset operation.</w:t>
       </w:r>
     </w:p>
     <w:p>
@@ -114,7 +320,26 @@
     </w:p>
     <w:p>
       <w:r>
-        <w:t>Enter a name and monitored contact email in SEC User-Agent on first launch, then save. SEC public-data APIs do not require an API key. The contact is sent to SEC.gov in a request header and is not displayed to other users. FilingLens limits request speed and caches responses on your Mac.</w:t>
+        <w:t xml:space="preserve">Enter a name and monitored contact email in </w:t>
+      </w:r>
+      <w:r>
+        <w:rPr>
+          <w:b/>
+        </w:rPr>
+        <w:t>SEC User-Agent</w:t>
+      </w:r>
+      <w:r>
+        <w:t xml:space="preserve"> on first launch, for example </w:t>
+      </w:r>
+      <w:r>
+        <w:rPr>
+          <w:rFonts w:ascii="Menlo" w:hAnsi="Menlo"/>
+          <w:sz w:val="18"/>
+        </w:rPr>
+        <w:t>FilingLens/1.0 Researcher name@example.com</w:t>
+      </w:r>
+      <w:r>
+        <w:t>, then save. The SEC public-data APIs do not require an API key; they ask automated clients to identify themselves in a request header. The contact address is sent to SEC.gov and is not displayed to other app users. FilingLens limits request speed and caches responses on your Mac.</w:t>
       </w:r>
     </w:p>
     <w:p>
@@ -251,7 +476,16 @@
         <w:t>Latest 10-Q</w:t>
       </w:r>
       <w:r>
-        <w:t>. Annual history retains the Income statement, Balance sheet, Cash flow, and Ratios &amp; growth views. Click an annual account row for its trend, available calculation components, and source concept. The latest-quarter view separates three-month income values, quarter-end balances, and fiscal year-to-date cash-flow values. It displays each mapped US-GAAP concept and period; it does not mix these values into annual charts. An em dash means no reliable value was available; it is not zero.</w:t>
+        <w:t xml:space="preserve">. Annual history retains the Income statement, Balance sheet, Cash flow, and Ratios &amp; growth views. Click an annual account row for its trend, available calculation components, and source concept. Hover over or focus a year in the trend to see its exact value. At the bottom of Annual history, </w:t>
+      </w:r>
+      <w:r>
+        <w:rPr>
+          <w:b/>
+        </w:rPr>
+        <w:t>Graph your financials</w:t>
+      </w:r>
+      <w:r>
+        <w:t xml:space="preserve"> lets you compare up to five accounts for the same company. Choose dollar values, percentages, or multiples, then select the accounts; hovering over a year shows all selected values together. Missing years are left blank. The latest-quarter view separates three-month income values, quarter-end balances, and fiscal year-to-date cash-flow values. It displays each mapped US-GAAP concept and period; it does not mix these values into annual charts. An em dash means no reliable value was available; it is not zero.</w:t>
       </w:r>
     </w:p>
     <w:p>
@@ -281,6 +515,151 @@
       </w:r>
       <w:r>
         <w:t xml:space="preserve"> for the reported income lines, nonoverlapping operating-expense detail, revenue splits, periods, and XBRL concepts. Product, business-segment, and geographic revenue are alternative views of the same total. A split appears only when its inline-XBRL categories reconcile to the filing's reported revenue. Some companies do not disclose a breakdown that can be verified this way.</w:t>
+      </w:r>
+    </w:p>
+    <w:p>
+      <w:pPr>
+        <w:pStyle w:val="Heading2"/>
+      </w:pPr>
+      <w:r>
+        <w:t>Time machine</w:t>
+      </w:r>
+    </w:p>
+    <w:p>
+      <w:r>
+        <w:t xml:space="preserve">Open </w:t>
+      </w:r>
+      <w:r>
+        <w:rPr>
+          <w:b/>
+        </w:rPr>
+        <w:t>Time machine</w:t>
+      </w:r>
+      <w:r>
+        <w:t xml:space="preserve"> in the sidebar to see how annual values were reported in different filings. </w:t>
+      </w:r>
+      <w:r>
+        <w:rPr>
+          <w:b/>
+        </w:rPr>
+        <w:t>All years</w:t>
+      </w:r>
+      <w:r>
+        <w:t xml:space="preserve"> puts multiple reporting years together; choose a year or use the arrow controls to focus on one. Year labels refer to the calendar year in which the reporting period ends; exact dates remain visible. Filter by account or show changed values only, then select a row to explore its reporting trail.</w:t>
+      </w:r>
+    </w:p>
+    <w:p>
+      <w:r>
+        <w:t>The version buttons and slider move between different reported values for the same exact period and US-GAAP concept. Repeated unchanged values are grouped. Each version shows its exact amount, filing date, accession, and SEC source; the final observation date also links to its source. A value that changed and later returned to its original amount still has a revision trail. The calculation cards show the resulting effects on free cash flow, selected growth rates, and margins when the necessary comparable inputs exist.</w:t>
+      </w:r>
+    </w:p>
+    <w:p>
+      <w:r>
+        <w:t>“First available” means the earliest eligible observation retained in today's SEC Company Facts data for the selected concept, not necessarily the original report. The first and latest inputs can have different filing dates. This is not a complete historical as-of database or a backtesting dataset. A reported-value change alone does not establish an accounting error or restatement. Different periods and concepts are not compared as revisions; ambiguous conflicting observations are omitted. The view works without AI.</w:t>
+      </w:r>
+    </w:p>
+    <w:p>
+      <w:pPr>
+        <w:pStyle w:val="Heading2"/>
+      </w:pPr>
+      <w:r>
+        <w:t>Quarterly history and TTM</w:t>
+      </w:r>
+    </w:p>
+    <w:p>
+      <w:r>
+        <w:t xml:space="preserve">In </w:t>
+      </w:r>
+      <w:r>
+        <w:rPr>
+          <w:b/>
+        </w:rPr>
+        <w:t>Financials</w:t>
+      </w:r>
+      <w:r>
+        <w:t xml:space="preserve">, select </w:t>
+      </w:r>
+      <w:r>
+        <w:rPr>
+          <w:b/>
+        </w:rPr>
+        <w:t>Quarterly history &amp; TTM</w:t>
+      </w:r>
+      <w:r>
+        <w:t xml:space="preserve">. Choose performance, cash flow, or balance sheet, change the chart account, and choose the number of recent quarters to display. Hover over or focus a chart bar to inspect its value. The table lists newest quarters first; </w:t>
+      </w:r>
+      <w:r>
+        <w:rPr>
+          <w:b/>
+        </w:rPr>
+        <w:t>Inspect sources</w:t>
+      </w:r>
+      <w:r>
+        <w:t xml:space="preserve"> reveals the exact values, periods, concepts, and filings behind each amount.</w:t>
+      </w:r>
+    </w:p>
+    <w:p>
+      <w:r>
+        <w:t xml:space="preserve">Income and cash-flow values cover standalone quarters. Where only cumulative cash flow is reported, FilingLens subtracts the preceding YTD observation with the same fiscal start and concept. A fourth quarter may be calculated from annual less nine-month values. Such cells are marked </w:t>
+      </w:r>
+      <w:r>
+        <w:rPr>
+          <w:b/>
+        </w:rPr>
+        <w:t>YTD difference</w:t>
+      </w:r>
+      <w:r>
+        <w:t xml:space="preserve">, with both operands retained. Balance sheets remain point-in-time. TTM totals sum four contiguous quarters with matching reporting boundaries; missing inputs remain unavailable. Later comparative disclosures can revise the inputs, and the operand filing dates remain visible. The separate </w:t>
+      </w:r>
+      <w:r>
+        <w:rPr>
+          <w:b/>
+        </w:rPr>
+        <w:t>Latest 10-Q</w:t>
+      </w:r>
+      <w:r>
+        <w:t xml:space="preserve"> view retains the filing's original three-month/YTD distinction.</w:t>
+      </w:r>
+    </w:p>
+    <w:p>
+      <w:pPr>
+        <w:pStyle w:val="Heading2"/>
+      </w:pPr>
+      <w:r>
+        <w:t>Compare peers</w:t>
+      </w:r>
+    </w:p>
+    <w:p>
+      <w:r>
+        <w:t xml:space="preserve">Open </w:t>
+      </w:r>
+      <w:r>
+        <w:rPr>
+          <w:b/>
+        </w:rPr>
+        <w:t>Compare peers</w:t>
+      </w:r>
+      <w:r>
+        <w:t xml:space="preserve"> in the sidebar. Add two to four tickers, including names from your saved companies, then select </w:t>
+      </w:r>
+      <w:r>
+        <w:rPr>
+          <w:b/>
+        </w:rPr>
+        <w:t>Compare companies</w:t>
+      </w:r>
+      <w:r>
+        <w:t>. FilingLens initially chooses the latest annual reporting end-year shared by the successfully loaded companies. Use the year selector to move to an earlier shared year. A failed company remains visible as a warning, and at least two loaded companies are required to display a comparison.</w:t>
+      </w:r>
+    </w:p>
+    <w:p>
+      <w:r>
+        <w:t>The table compares revenue, growth, operating/net/FCF margins, free cash flow, current ratio, and mapped long-term debt divided by assets. Each column shows the company's exact fiscal period; a shared end-year does not mean identical reporting dates. Margins require exactly matched duration inputs, and growth requires a comparable adjacent prior annual period using the same concept. Missing values stay unavailable. Every calculated cell exposes its source operands. There are no market-price valuation multiples or investment rankings.</w:t>
+      </w:r>
+    </w:p>
+    <w:p>
+      <w:r>
+        <w:t>Workspace, topic, and Time Machine year changes use short transitions. System reduced-motion preferences disable animation and smooth scrolling.</w:t>
       </w:r>
     </w:p>
     <w:p>
@@ -367,6 +746,93 @@
       </w:r>
       <w:r>
         <w:t xml:space="preserve"> loads recent Forms 4 and filters purchases, sales, and other transactions; each row links to its SEC filing.</w:t>
+      </w:r>
+    </w:p>
+    <w:p>
+      <w:r>
+        <w:t xml:space="preserve">Open the arrow beside an annual movement to start an </w:t>
+      </w:r>
+      <w:r>
+        <w:rPr>
+          <w:b/>
+        </w:rPr>
+        <w:t>evidence trail</w:t>
+      </w:r>
+      <w:r>
+        <w:t>. Inspect the prior and current values, expand their exact calculation inputs and SEC sources, and compare up to three related movements. The previous available observation is shown explicitly; a missing-year gap is flagged rather than presented as a consecutive-year comparison.</w:t>
+      </w:r>
+    </w:p>
+    <w:p>
+      <w:r>
+        <w:t xml:space="preserve">Choose </w:t>
+      </w:r>
+      <w:r>
+        <w:rPr>
+          <w:b/>
+        </w:rPr>
+        <w:t>Find filing passages</w:t>
+      </w:r>
+      <w:r>
+        <w:t xml:space="preserve"> to read annual documents tied to the selected source facts. This runs locally without an AI model. Passages are lexical research leads, not verified explanations. Historical values may come from later comparative or revised filings; every source retains its reporting period and filing date. If the matching document or a relevant passage is unavailable, FilingLens keeps the numerical evidence and shows the limitation instead of substituting an unrelated latest report.</w:t>
+      </w:r>
+    </w:p>
+    <w:p>
+      <w:r>
+        <w:t xml:space="preserve">Under </w:t>
+      </w:r>
+      <w:r>
+        <w:rPr>
+          <w:b/>
+        </w:rPr>
+        <w:t>Your interpretation</w:t>
+      </w:r>
+      <w:r>
+        <w:t xml:space="preserve">, add your own hypothesis, attach source evidence, and record your judgment as </w:t>
+      </w:r>
+      <w:r>
+        <w:rPr>
+          <w:b/>
+        </w:rPr>
+        <w:t>Unresolved</w:t>
+      </w:r>
+      <w:r>
+        <w:t xml:space="preserve">, </w:t>
+      </w:r>
+      <w:r>
+        <w:rPr>
+          <w:b/>
+        </w:rPr>
+        <w:t>Supported</w:t>
+      </w:r>
+      <w:r>
+        <w:t xml:space="preserve">, or </w:t>
+      </w:r>
+      <w:r>
+        <w:rPr>
+          <w:b/>
+        </w:rPr>
+        <w:t>Contradicted</w:t>
+      </w:r>
+      <w:r>
+        <w:t xml:space="preserve">. These are your assessments. Hypotheses, notes, and attached evidence snapshots are saved locally for the exact source observations. Reopening the same investigation restores them; revised source inputs create a separate investigation. Clearing app website data removes these local reviews. </w:t>
+      </w:r>
+      <w:r>
+        <w:rPr>
+          <w:b/>
+        </w:rPr>
+        <w:t>Export investigation</w:t>
+      </w:r>
+      <w:r>
+        <w:t xml:space="preserve"> saves the figures, retrieved passages, hypotheses, judgments, attached evidence, and limitations as Markdown. The Mac app writes a uniquely named file in its local export folder, displays the exact path, and offers </w:t>
+      </w:r>
+      <w:r>
+        <w:rPr>
+          <w:b/>
+        </w:rPr>
+        <w:t>Show export folder</w:t>
+      </w:r>
+      <w:r>
+        <w:t>; browser development sessions use a normal download. If local saving fails, an explicit warning directs you to export before leaving.</w:t>
       </w:r>
     </w:p>
     <w:p>
@@ -1134,7 +1600,7 @@
     </w:p>
     <w:p>
       <w:r>
-        <w:t xml:space="preserve">SEC files are public and downloaded from SEC.gov. The Mac app listens only on your computer and uses a private session token between its window and local service. It stores SEC cache and non-secret preferences under </w:t>
+        <w:t xml:space="preserve">SEC files are public and downloaded from SEC.gov. The Mac app listens only on your computer and uses a private session token between its window and local service. It stores SEC cache and service settings under </w:t>
       </w:r>
       <w:r>
         <w:rPr>
@@ -1145,6 +1611,39 @@
       </w:r>
       <w:r>
         <w:t>; cloud keys go to macOS Keychain. Nothing from an existing Streamlit checkout is copied into a new Mac installation. FilingLens does not provide real-time prices or personalized investment advice.</w:t>
+      </w:r>
+    </w:p>
+    <w:p>
+      <w:pPr>
+        <w:pStyle w:val="Heading1"/>
+      </w:pPr>
+      <w:r>
+        <w:t>Storage and provider discovery</w:t>
+      </w:r>
+    </w:p>
+    <w:p>
+      <w:r>
+        <w:t xml:space="preserve">SEC cache and service settings are stored under </w:t>
+      </w:r>
+      <w:r>
+        <w:rPr>
+          <w:rFonts w:ascii="Menlo" w:hAnsi="Menlo"/>
+          <w:sz w:val="18"/>
+        </w:rPr>
+        <w:t>~/Library/Application Support/FilingLens</w:t>
+      </w:r>
+      <w:r>
+        <w:t xml:space="preserve">. Saved research approaches and investigation reviews use the app webview’s local storage. Markdown investigations are written under </w:t>
+      </w:r>
+      <w:r>
+        <w:rPr>
+          <w:rFonts w:ascii="Menlo" w:hAnsi="Menlo"/>
+          <w:sz w:val="18"/>
+        </w:rPr>
+        <w:t>~/Library/Application Support/com.filinglens.desktop/exports</w:t>
+      </w:r>
+      <w:r>
+        <w:t>. Saved cloud keys use macOS Keychain; trusted process environment settings can also provide a key. Configured cloud providers may receive authenticated model-discovery requests at startup or when availability is refreshed. Questions and filing evidence are sent only when you request generation using that provider. Local provider addresses default to loopback and can be overridden by trusted environment settings.</w:t>
       </w:r>
     </w:p>
     <w:sectPr>

</xml_diff>

<commit_message>
Add verified drag-to-Applications DMG packaging and installation guides
</commit_message>
<xml_diff>
--- a/docs/FilingLens_Desktop_User_Guide.docx
+++ b/docs/FilingLens_Desktop_User_Guide.docx
@@ -28,7 +28,7 @@
     </w:p>
     <w:p>
       <w:r>
-        <w:t xml:space="preserve">The current ZIP is for </w:t>
+        <w:t xml:space="preserve">The current DMG and ZIP are for </w:t>
       </w:r>
       <w:r>
         <w:rPr>
@@ -67,7 +67,7 @@
           <w:rFonts w:ascii="Menlo" w:hAnsi="Menlo"/>
           <w:sz w:val="18"/>
         </w:rPr>
-        <w:t>FilingLens-0.3.0-macOS-arm64.zip</w:t>
+        <w:t>FilingLens-0.3.0-macOS-arm64.dmg</w:t>
       </w:r>
       <w:r>
         <w:t xml:space="preserve"> under </w:t>
@@ -87,7 +87,7 @@
         <w:pStyle w:val="ListNumber"/>
       </w:pPr>
       <w:r>
-        <w:t xml:space="preserve">In Finder, double-click the ZIP. Move </w:t>
+        <w:t xml:space="preserve">Open the DMG and drag </w:t>
       </w:r>
       <w:r>
         <w:rPr>
@@ -96,7 +96,7 @@
         <w:t>FilingLens.app</w:t>
       </w:r>
       <w:r>
-        <w:t xml:space="preserve"> into </w:t>
+        <w:t xml:space="preserve"> onto the </w:t>
       </w:r>
       <w:r>
         <w:rPr>
@@ -105,7 +105,16 @@
         <w:t>Applications</w:t>
       </w:r>
       <w:r>
-        <w:t xml:space="preserve"> (Finder &gt; Go &gt; Applications).</w:t>
+        <w:t xml:space="preserve"> shortcut. Quit any older FilingLens app first and confirm </w:t>
+      </w:r>
+      <w:r>
+        <w:rPr>
+          <w:b/>
+        </w:rPr>
+        <w:t>Replace</w:t>
+      </w:r>
+      <w:r>
+        <w:t xml:space="preserve"> if updating. Eject the disk image after copying.</w:t>
       </w:r>
     </w:p>
     <w:p>
@@ -113,7 +122,7 @@
         <w:pStyle w:val="ListNumber"/>
       </w:pPr>
       <w:r>
-        <w:t xml:space="preserve">Double-click </w:t>
+        <w:t xml:space="preserve">Open </w:t>
       </w:r>
       <w:r>
         <w:rPr>
@@ -122,7 +131,7 @@
         <w:t>FilingLens.app</w:t>
       </w:r>
       <w:r>
-        <w:t xml:space="preserve">. Because Apple has not notarized this build, macOS may say it </w:t>
+        <w:t xml:space="preserve"> from Applications. Because Apple has not notarized this build, macOS may say it </w:t>
       </w:r>
       <w:r>
         <w:rPr>
@@ -224,7 +233,7 @@
         <w:t>Open Anyway</w:t>
       </w:r>
       <w:r>
-        <w:t xml:space="preserve"> if you trust the ZIP from this repository's release page. If macOS says the app </w:t>
+        <w:t xml:space="preserve"> if you trust the download from this repository's release page. If macOS says the app </w:t>
       </w:r>
       <w:r>
         <w:rPr>
@@ -264,6 +273,20 @@
       </w:r>
       <w:r>
         <w:t xml:space="preserve"> explains what the warnings mean.</w:t>
+      </w:r>
+    </w:p>
+    <w:p>
+      <w:r>
+        <w:t xml:space="preserve">The ZIP remains available as an alternative: unzip it and move </w:t>
+      </w:r>
+      <w:r>
+        <w:rPr>
+          <w:b/>
+        </w:rPr>
+        <w:t>FilingLens.app</w:t>
+      </w:r>
+      <w:r>
+        <w:t xml:space="preserve"> into Applications. The DMG contains the same verified app; it does not install a background service or remove the first-launch approval requirement.</w:t>
       </w:r>
     </w:p>
     <w:p>
@@ -999,6 +1022,7 @@
       </w:tblGrid>
       <w:tr>
         <w:trPr>
+          <w:cantSplit/>
           <w:tblHeader w:val="true"/>
         </w:trPr>
         <w:tc>
@@ -1081,6 +1105,9 @@
         </w:tc>
       </w:tr>
       <w:tr>
+        <w:trPr>
+          <w:cantSplit/>
+        </w:trPr>
         <w:tc>
           <w:tcPr>
             <w:tcW w:type="dxa" w:w="2995"/>
@@ -1151,6 +1178,9 @@
         </w:tc>
       </w:tr>
       <w:tr>
+        <w:trPr>
+          <w:cantSplit/>
+        </w:trPr>
         <w:tc>
           <w:tcPr>
             <w:tcW w:type="dxa" w:w="2995"/>
@@ -1223,6 +1253,9 @@
         </w:tc>
       </w:tr>
       <w:tr>
+        <w:trPr>
+          <w:cantSplit/>
+        </w:trPr>
         <w:tc>
           <w:tcPr>
             <w:tcW w:type="dxa" w:w="2995"/>
@@ -1306,6 +1339,9 @@
         </w:tc>
       </w:tr>
       <w:tr>
+        <w:trPr>
+          <w:cantSplit/>
+        </w:trPr>
         <w:tc>
           <w:tcPr>
             <w:tcW w:type="dxa" w:w="2995"/>
@@ -1378,6 +1414,9 @@
         </w:tc>
       </w:tr>
       <w:tr>
+        <w:trPr>
+          <w:cantSplit/>
+        </w:trPr>
         <w:tc>
           <w:tcPr>
             <w:tcW w:type="dxa" w:w="2995"/>
@@ -1448,6 +1487,9 @@
         </w:tc>
       </w:tr>
       <w:tr>
+        <w:trPr>
+          <w:cantSplit/>
+        </w:trPr>
         <w:tc>
           <w:tcPr>
             <w:tcW w:type="dxa" w:w="2995"/>
@@ -1520,6 +1562,9 @@
         </w:tc>
       </w:tr>
       <w:tr>
+        <w:trPr>
+          <w:cantSplit/>
+        </w:trPr>
         <w:tc>
           <w:tcPr>
             <w:tcW w:type="dxa" w:w="2995"/>
@@ -1644,6 +1689,39 @@
       </w:r>
       <w:r>
         <w:t>. Saved cloud keys use macOS Keychain; trusted process environment settings can also provide a key. Configured cloud providers may receive authenticated model-discovery requests at startup or when availability is refreshed. Questions and filing evidence are sent only when you request generation using that provider. Local provider addresses default to loopback and can be overridden by trusted environment settings.</w:t>
+      </w:r>
+    </w:p>
+    <w:p>
+      <w:pPr>
+        <w:pStyle w:val="Heading1"/>
+      </w:pPr>
+      <w:r>
+        <w:t>Build a disk image</w:t>
+      </w:r>
+    </w:p>
+    <w:p>
+      <w:r>
+        <w:t xml:space="preserve">Release maintainers can run </w:t>
+      </w:r>
+      <w:r>
+        <w:rPr>
+          <w:rFonts w:ascii="Menlo" w:hAnsi="Menlo"/>
+          <w:sz w:val="18"/>
+        </w:rPr>
+        <w:t>./scripts/package_dmg_macos.sh /path/to/FilingLens.app release</w:t>
+      </w:r>
+      <w:r>
+        <w:t xml:space="preserve"> on macOS with </w:t>
+      </w:r>
+      <w:r>
+        <w:rPr>
+          <w:rFonts w:ascii="Menlo" w:hAnsi="Menlo"/>
+          <w:sz w:val="18"/>
+        </w:rPr>
+        <w:t>uv</w:t>
+      </w:r>
+      <w:r>
+        <w:t xml:space="preserve"> installed. The helper verifies the existing app signature, uses pinned dmgbuild 1.6.7 for a read-only image with an Applications shortcut, and verifies the image checksum. It packages the existing app without changing its code signature. The clean release helper creates both ZIP and DMG when uv is available. Signing and Apple notarization remain separate steps.</w:t>
       </w:r>
     </w:p>
     <w:sectPr>

</xml_diff>